<commit_message>
Adiciona panorama de despachantes/parceiros e o marco ANVISA 2026
Novo doc DESPACHANTES_E_PARCEIROS_AUTORIZACAO (plataformas de
autorizacao RDC 660, recomendacao de parcerias) e atualizacao do guia
do HC e do roteiro com as RDCs 1.011-1.015/2026, incluindo o sandbox
de associacoes da RDC 1.014/2026. Versoes Word regeneradas.

Co-Authored-By: Claude Fable 5 <noreply@anthropic.com>
Claude-Session: https://claude.ai/code/session_018WZd4PZy53xqMaYcFDrxLe
</commit_message>
<xml_diff>
--- a/docs/cannabis/HABEAS_CORPUS_CULTIVO.docx
+++ b/docs/cannabis/HABEAS_CORPUS_CULTIVO.docx
@@ -822,6 +822,94 @@
       </w:pPr>
       <w:r>
         <w:t xml:space="preserve">Nao impetrar cedo demais: um HC negado por dossie fraco cria precedente local desfavoravel e atrasa a fase 4. O historico da fase 2 e o que separa os casos deferidos dos indeferidos.</w:t>
+      </w:r>
+    </w:p>
+    <w:p>
+      <w:pPr>
+        <w:pStyle w:val="Heading1"/>
+        <w:jc w:val="center"/>
+      </w:pPr>
+      <w:r>
+        <w:rPr>
+          <w:b/>
+          <w:bCs/>
+        </w:rPr>
+        <w:t xml:space="preserve">9. Atualizacao — o marco ANVISA de 2026 e o sandbox das associacoes</w:t>
+      </w:r>
+    </w:p>
+    <w:p>
+      <w:pPr>
+        <w:spacing w:after="160"/>
+        <w:jc w:val="both"/>
+      </w:pPr>
+      <w:r>
+        <w:t xml:space="preserve">Em janeiro-fevereiro de 2026 a ANVISA publicou as RDCs 1.011 a 1.015/2026 (em vigor desde 04/08/2026). A RDC 1.014/2026 cria um Sandbox Regulatorio exclusivo para associacoes de pacientes sem fins lucrativos: ambiente experimental de ate 5 anos, sob supervisao direta da agencia, sem comercializacao — a primeira via ADMINISTRATIVA de cultivo associativo, que antes so existia pela via judicial.</w:t>
+      </w:r>
+    </w:p>
+    <w:p>
+      <w:pPr>
+        <w:spacing w:after="160"/>
+        <w:jc w:val="both"/>
+      </w:pPr>
+      <w:r>
+        <w:t xml:space="preserve">Efeito pratico para a Gota Verde:</w:t>
+      </w:r>
+    </w:p>
+    <w:p>
+      <w:pPr>
+        <w:pStyle w:val="ListParagraph"/>
+        <w:numPr>
+          <w:ilvl w:val="0"/>
+          <w:numId w:val="1"/>
+        </w:numPr>
+      </w:pPr>
+      <w:r>
+        <w:t xml:space="preserve">o requisito de corte e associacao constituida ha no minimo 2 anos na data de publicacao da RDC; uma associacao fundada agora nao entra no primeiro ciclo, e a selecao depende de edital de chamamento publico ainda nao publicado (ate 25/08/2026);</w:t>
+      </w:r>
+    </w:p>
+    <w:p>
+      <w:pPr>
+        <w:pStyle w:val="ListParagraph"/>
+        <w:numPr>
+          <w:ilvl w:val="0"/>
+          <w:numId w:val="1"/>
+        </w:numPr>
+      </w:pPr>
+      <w:r>
+        <w:t xml:space="preserve">portanto o HC preventivo segue sendo a via realista de cultivo no horizonte de 1 a 2 anos, e as duas vias se complementam: o mesmo dossie (pacientes, protocolo tecnico, prestacao de contas auditavel) serve ao juiz hoje e ao edital do sandbox amanha;</w:t>
+      </w:r>
+    </w:p>
+    <w:p>
+      <w:pPr>
+        <w:pStyle w:val="ListParagraph"/>
+        <w:numPr>
+          <w:ilvl w:val="0"/>
+          <w:numId w:val="1"/>
+        </w:numPr>
+      </w:pPr>
+      <w:r>
+        <w:t xml:space="preserve">o proprio sandbox fortalece o HC como argumento: o Estado reconheceu formalmente que o cultivo associativo e atividade legitima a regular, nao a criminalizar;</w:t>
+      </w:r>
+    </w:p>
+    <w:p>
+      <w:pPr>
+        <w:pStyle w:val="ListParagraph"/>
+        <w:numPr>
+          <w:ilvl w:val="0"/>
+          <w:numId w:val="1"/>
+        </w:numPr>
+      </w:pPr>
+      <w:r>
+        <w:t xml:space="preserve">monitorar os editais da RDC 1.014 e um item permanente do roadmap.</w:t>
+      </w:r>
+    </w:p>
+    <w:p>
+      <w:pPr>
+        <w:spacing w:after="160"/>
+        <w:jc w:val="both"/>
+      </w:pPr>
+      <w:r>
+        <w:t xml:space="preserve">Detalhes do marco e das plataformas de mercado no documento DESPACHANTES_E_PARCEIROS_AUTORIZACAO.</w:t>
       </w:r>
     </w:p>
     <w:sectPr>

</xml_diff>